<commit_message>
creacion de la descripcion del sistema
</commit_message>
<xml_diff>
--- a/descripcionSistema.docx
+++ b/descripcionSistema.docx
@@ -161,16 +161,154 @@
     </w:p>
     <w:p>
       <w:pPr>
-        <w:rPr>
-          <w:b/>
-          <w:bCs/>
-        </w:rPr>
-      </w:pPr>
-      <w:r>
-        <w:rPr>
-          <w:b/>
-          <w:bCs/>
-        </w:rPr>
+        <w:jc w:val="center"/>
+        <w:rPr>
+          <w:b/>
+          <w:bCs/>
+        </w:rPr>
+      </w:pPr>
+      <w:r>
+        <w:rPr>
+          <w:b/>
+          <w:bCs/>
+          <w:noProof/>
+        </w:rPr>
+        <w:drawing>
+          <wp:inline distT="0" distB="0" distL="0" distR="0" wp14:anchorId="758B9C39" wp14:editId="7BA29096">
+            <wp:extent cx="5783310" cy="2295525"/>
+            <wp:effectExtent l="0" t="0" r="8255" b="0"/>
+            <wp:docPr id="4" name="Imagen 4"/>
+            <wp:cNvGraphicFramePr>
+              <a:graphicFrameLocks xmlns:a="http://schemas.openxmlformats.org/drawingml/2006/main" noChangeAspect="1"/>
+            </wp:cNvGraphicFramePr>
+            <a:graphic xmlns:a="http://schemas.openxmlformats.org/drawingml/2006/main">
+              <a:graphicData uri="http://schemas.openxmlformats.org/drawingml/2006/picture">
+                <pic:pic xmlns:pic="http://schemas.openxmlformats.org/drawingml/2006/picture">
+                  <pic:nvPicPr>
+                    <pic:cNvPr id="4" name="Imagen 4"/>
+                    <pic:cNvPicPr/>
+                  </pic:nvPicPr>
+                  <pic:blipFill>
+                    <a:blip r:embed="rId6" cstate="print">
+                      <a:extLst>
+                        <a:ext uri="{28A0092B-C50C-407E-A947-70E740481C1C}">
+                          <a14:useLocalDpi xmlns:a14="http://schemas.microsoft.com/office/drawing/2010/main" val="0"/>
+                        </a:ext>
+                      </a:extLst>
+                    </a:blip>
+                    <a:stretch>
+                      <a:fillRect/>
+                    </a:stretch>
+                  </pic:blipFill>
+                  <pic:spPr>
+                    <a:xfrm>
+                      <a:off x="0" y="0"/>
+                      <a:ext cx="5788338" cy="2297521"/>
+                    </a:xfrm>
+                    <a:prstGeom prst="rect">
+                      <a:avLst/>
+                    </a:prstGeom>
+                  </pic:spPr>
+                </pic:pic>
+              </a:graphicData>
+            </a:graphic>
+          </wp:inline>
+        </w:drawing>
+      </w:r>
+    </w:p>
+    <w:p>
+      <w:pPr>
+        <w:rPr>
+          <w:b/>
+          <w:bCs/>
+        </w:rPr>
+      </w:pPr>
+    </w:p>
+    <w:p>
+      <w:pPr>
+        <w:rPr>
+          <w:b/>
+          <w:bCs/>
+        </w:rPr>
+      </w:pPr>
+    </w:p>
+    <w:p>
+      <w:pPr>
+        <w:rPr>
+          <w:b/>
+          <w:bCs/>
+        </w:rPr>
+      </w:pPr>
+    </w:p>
+    <w:p>
+      <w:pPr>
+        <w:rPr>
+          <w:b/>
+          <w:bCs/>
+        </w:rPr>
+      </w:pPr>
+    </w:p>
+    <w:p>
+      <w:pPr>
+        <w:rPr>
+          <w:b/>
+          <w:bCs/>
+        </w:rPr>
+      </w:pPr>
+    </w:p>
+    <w:p>
+      <w:pPr>
+        <w:rPr>
+          <w:b/>
+          <w:bCs/>
+        </w:rPr>
+      </w:pPr>
+    </w:p>
+    <w:p>
+      <w:pPr>
+        <w:rPr>
+          <w:b/>
+          <w:bCs/>
+        </w:rPr>
+      </w:pPr>
+    </w:p>
+    <w:p>
+      <w:pPr>
+        <w:rPr>
+          <w:b/>
+          <w:bCs/>
+        </w:rPr>
+      </w:pPr>
+    </w:p>
+    <w:p>
+      <w:pPr>
+        <w:rPr>
+          <w:b/>
+          <w:bCs/>
+        </w:rPr>
+      </w:pPr>
+    </w:p>
+    <w:p>
+      <w:pPr>
+        <w:rPr>
+          <w:b/>
+          <w:bCs/>
+        </w:rPr>
+      </w:pPr>
+    </w:p>
+    <w:p>
+      <w:pPr>
+        <w:rPr>
+          <w:b/>
+          <w:bCs/>
+        </w:rPr>
+      </w:pPr>
+      <w:r>
+        <w:rPr>
+          <w:b/>
+          <w:bCs/>
+        </w:rPr>
+        <w:lastRenderedPageBreak/>
         <w:t>convención de ejes:</w:t>
       </w:r>
     </w:p>
@@ -200,7 +338,7 @@
                 <wp:cNvGraphicFramePr/>
                 <a:graphic xmlns:a="http://schemas.openxmlformats.org/drawingml/2006/main">
                   <a:graphicData uri="http://schemas.microsoft.com/office/word/2010/wordprocessingInk">
-                    <w14:contentPart bwMode="auto" r:id="rId6">
+                    <w14:contentPart bwMode="auto" r:id="rId7">
                       <w14:nvContentPartPr>
                         <w14:cNvContentPartPr/>
                       </w14:nvContentPartPr>
@@ -216,7 +354,7 @@
           </mc:Choice>
           <mc:Fallback>
             <w:pict>
-              <v:shapetype w14:anchorId="5F5E63E6" id="_x0000_t75" coordsize="21600,21600" o:spt="75" o:preferrelative="t" path="m@4@5l@4@11@9@11@9@5xe" filled="f" stroked="f">
+              <v:shapetype w14:anchorId="08F5754C" id="_x0000_t75" coordsize="21600,21600" o:spt="75" o:preferrelative="t" path="m@4@5l@4@11@9@11@9@5xe" filled="f" stroked="f">
                 <v:stroke joinstyle="miter"/>
                 <v:formulas>
                   <v:f eqn="if lineDrawn pixelLineWidth 0"/>
@@ -236,7 +374,7 @@
                 <o:lock v:ext="edit" aspectratio="t"/>
               </v:shapetype>
               <v:shape id="Entrada de lápiz 31" o:spid="_x0000_s1026" type="#_x0000_t75" style="position:absolute;margin-left:52.25pt;margin-top:238.7pt;width:48.2pt;height:63.3pt;z-index:251678720;visibility:visible;mso-wrap-style:square;mso-wrap-distance-left:9pt;mso-wrap-distance-top:0;mso-wrap-distance-right:9pt;mso-wrap-distance-bottom:0;mso-position-horizontal:absolute;mso-position-horizontal-relative:text;mso-position-vertical:absolute;mso-position-vertical-relative:text" o:gfxdata="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">
-                <v:imagedata r:id="rId7" o:title=""/>
+                <v:imagedata r:id="rId8" o:title=""/>
               </v:shape>
             </w:pict>
           </mc:Fallback>
@@ -264,7 +402,7 @@
                 <wp:cNvGraphicFramePr/>
                 <a:graphic xmlns:a="http://schemas.openxmlformats.org/drawingml/2006/main">
                   <a:graphicData uri="http://schemas.microsoft.com/office/word/2010/wordprocessingInk">
-                    <w14:contentPart bwMode="auto" r:id="rId8">
+                    <w14:contentPart bwMode="auto" r:id="rId9">
                       <w14:nvContentPartPr>
                         <w14:cNvContentPartPr/>
                       </w14:nvContentPartPr>
@@ -280,8 +418,8 @@
           </mc:Choice>
           <mc:Fallback>
             <w:pict>
-              <v:shape w14:anchorId="3AA0B65A" id="Entrada de lápiz 21" o:spid="_x0000_s1026" type="#_x0000_t75" style="position:absolute;margin-left:38.3pt;margin-top:301.9pt;width:56.9pt;height:62.7pt;z-index:251671552;visibility:visible;mso-wrap-style:square;mso-wrap-distance-left:9pt;mso-wrap-distance-top:0;mso-wrap-distance-right:9pt;mso-wrap-distance-bottom:0;mso-position-horizontal:absolute;mso-position-horizontal-relative:text;mso-position-vertical:absolute;mso-position-vertical-relative:text" o:gfxdata="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">
-                <v:imagedata r:id="rId9" o:title=""/>
+              <v:shape w14:anchorId="5ABDE850" id="Entrada de lápiz 21" o:spid="_x0000_s1026" type="#_x0000_t75" style="position:absolute;margin-left:38.3pt;margin-top:301.9pt;width:56.9pt;height:62.7pt;z-index:251671552;visibility:visible;mso-wrap-style:square;mso-wrap-distance-left:9pt;mso-wrap-distance-top:0;mso-wrap-distance-right:9pt;mso-wrap-distance-bottom:0;mso-position-horizontal:absolute;mso-position-horizontal-relative:text;mso-position-vertical:absolute;mso-position-vertical-relative:text" o:gfxdata="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">
+                <v:imagedata r:id="rId10" o:title=""/>
               </v:shape>
             </w:pict>
           </mc:Fallback>
@@ -309,7 +447,7 @@
                 <wp:cNvGraphicFramePr/>
                 <a:graphic xmlns:a="http://schemas.openxmlformats.org/drawingml/2006/main">
                   <a:graphicData uri="http://schemas.microsoft.com/office/word/2010/wordprocessingInk">
-                    <w14:contentPart bwMode="auto" r:id="rId10">
+                    <w14:contentPart bwMode="auto" r:id="rId11">
                       <w14:nvContentPartPr>
                         <w14:cNvContentPartPr/>
                       </w14:nvContentPartPr>
@@ -325,16 +463,19 @@
           </mc:Choice>
           <mc:Fallback>
             <w:pict>
-              <v:shape w14:anchorId="2FA96A7B" id="Entrada de lápiz 16" o:spid="_x0000_s1026" type="#_x0000_t75" style="position:absolute;margin-left:83.55pt;margin-top:303.75pt;width:37.7pt;height:75.1pt;z-index:251666432;visibility:visible;mso-wrap-style:square;mso-wrap-distance-left:9pt;mso-wrap-distance-top:0;mso-wrap-distance-right:9pt;mso-wrap-distance-bottom:0;mso-position-horizontal:absolute;mso-position-horizontal-relative:text;mso-position-vertical:absolute;mso-position-vertical-relative:text" o:gfxdata="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">
-                <v:imagedata r:id="rId11" o:title=""/>
+              <v:shape w14:anchorId="25235DB1" id="Entrada de lápiz 16" o:spid="_x0000_s1026" type="#_x0000_t75" style="position:absolute;margin-left:83.55pt;margin-top:303.75pt;width:37.7pt;height:75.1pt;z-index:251666432;visibility:visible;mso-wrap-style:square;mso-wrap-distance-left:9pt;mso-wrap-distance-top:0;mso-wrap-distance-right:9pt;mso-wrap-distance-bottom:0;mso-position-horizontal:absolute;mso-position-horizontal-relative:text;mso-position-vertical:absolute;mso-position-vertical-relative:text" o:gfxdata="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">
+                <v:imagedata r:id="rId12" o:title=""/>
               </v:shape>
             </w:pict>
           </mc:Fallback>
         </mc:AlternateContent>
       </w:r>
       <w:r>
+        <w:rPr>
+          <w:noProof/>
+        </w:rPr>
         <w:drawing>
-          <wp:inline distT="0" distB="0" distL="0" distR="0" wp14:anchorId="68ACF25A" wp14:editId="25FE6C4A">
+          <wp:inline distT="0" distB="0" distL="0" distR="0" wp14:anchorId="68ACF25A" wp14:editId="6F4DF6E6">
             <wp:extent cx="4744076" cy="4812336"/>
             <wp:effectExtent l="0" t="0" r="0" b="7620"/>
             <wp:docPr id="3" name="Imagen 3"/>
@@ -349,7 +490,7 @@
                     <pic:cNvPicPr/>
                   </pic:nvPicPr>
                   <pic:blipFill>
-                    <a:blip r:embed="rId12"/>
+                    <a:blip r:embed="rId13"/>
                     <a:stretch>
                       <a:fillRect/>
                     </a:stretch>
@@ -357,7 +498,7 @@
                   <pic:spPr>
                     <a:xfrm>
                       <a:off x="0" y="0"/>
-                      <a:ext cx="4752563" cy="4820945"/>
+                      <a:ext cx="4744076" cy="4812336"/>
                     </a:xfrm>
                     <a:prstGeom prst="rect">
                       <a:avLst/>
@@ -382,301 +523,204 @@
           <w:b/>
           <w:bCs/>
         </w:rPr>
+        <w:t>unidades:</w:t>
+      </w:r>
+    </w:p>
+    <w:p>
+      <w:r>
+        <w:t xml:space="preserve"> </w:t>
+      </w:r>
+      <w:proofErr w:type="spellStart"/>
+      <w:r>
+        <w:t>user_id</w:t>
+      </w:r>
+      <w:proofErr w:type="spellEnd"/>
+      <w:r>
+        <w:t>: Entero sin unidad (Identificador).</w:t>
+      </w:r>
+    </w:p>
+    <w:p>
+      <w:proofErr w:type="spellStart"/>
+      <w:r>
+        <w:t>trial_id</w:t>
+      </w:r>
+      <w:proofErr w:type="spellEnd"/>
+      <w:r>
+        <w:t>: Entero sin unidad (Número de ensayo).</w:t>
+      </w:r>
+    </w:p>
+    <w:p>
+      <w:proofErr w:type="spellStart"/>
+      <w:r>
+        <w:t>sample_id</w:t>
+      </w:r>
+      <w:proofErr w:type="spellEnd"/>
+      <w:r>
+        <w:t>: Entero sin unidad (Número de muestra consecutiva).</w:t>
+      </w:r>
+    </w:p>
+    <w:p>
+      <w:proofErr w:type="spellStart"/>
+      <w:r>
+        <w:t>a_x</w:t>
+      </w:r>
+      <w:proofErr w:type="spellEnd"/>
+      <w:r>
+        <w:t xml:space="preserve">, </w:t>
+      </w:r>
+      <w:proofErr w:type="spellStart"/>
+      <w:r>
+        <w:t>a_y</w:t>
+      </w:r>
+      <w:proofErr w:type="spellEnd"/>
+      <w:r>
+        <w:t xml:space="preserve">, </w:t>
+      </w:r>
+      <w:proofErr w:type="spellStart"/>
+      <w:r>
+        <w:t>a_z</w:t>
+      </w:r>
+      <w:proofErr w:type="spellEnd"/>
+      <w:r>
+        <w:t xml:space="preserve">: </w:t>
+      </w:r>
+      <w:r>
+        <w:t>Metros por segundo al cuadrado.</w:t>
+      </w:r>
+    </w:p>
+    <w:p>
+      <w:r>
+        <w:t xml:space="preserve">  </w:t>
+      </w:r>
+      <w:proofErr w:type="spellStart"/>
+      <w:r>
+        <w:t>w_x</w:t>
+      </w:r>
+      <w:proofErr w:type="spellEnd"/>
+      <w:r>
+        <w:t xml:space="preserve">, </w:t>
+      </w:r>
+      <w:proofErr w:type="spellStart"/>
+      <w:r>
+        <w:t>w_y</w:t>
+      </w:r>
+      <w:proofErr w:type="spellEnd"/>
+      <w:r>
+        <w:t xml:space="preserve">, </w:t>
+      </w:r>
+      <w:proofErr w:type="spellStart"/>
+      <w:r>
+        <w:t>w_z</w:t>
+      </w:r>
+      <w:proofErr w:type="spellEnd"/>
+      <w:r>
+        <w:t xml:space="preserve">: rad/s </w:t>
+      </w:r>
+      <w:r>
+        <w:t>Grados por segundo.</w:t>
+      </w:r>
+    </w:p>
+    <w:p>
+      <w:r>
+        <w:t xml:space="preserve">  </w:t>
+      </w:r>
+      <w:proofErr w:type="spellStart"/>
+      <w:r>
+        <w:t>m_x</w:t>
+      </w:r>
+      <w:proofErr w:type="spellEnd"/>
+      <w:r>
+        <w:t xml:space="preserve">, </w:t>
+      </w:r>
+      <w:proofErr w:type="spellStart"/>
+      <w:r>
+        <w:t>m_y</w:t>
+      </w:r>
+      <w:proofErr w:type="spellEnd"/>
+      <w:r>
+        <w:t xml:space="preserve">, </w:t>
+      </w:r>
+      <w:proofErr w:type="spellStart"/>
+      <w:r>
+        <w:t>m_z</w:t>
+      </w:r>
+      <w:proofErr w:type="spellEnd"/>
+      <w:r>
+        <w:t xml:space="preserve">: </w:t>
+      </w:r>
+      <w:proofErr w:type="spellStart"/>
+      <w:r>
+        <w:t>Microteslas</w:t>
+      </w:r>
+      <w:proofErr w:type="spellEnd"/>
+      <w:r>
+        <w:t>.</w:t>
+      </w:r>
+    </w:p>
+    <w:p>
+      <w:r>
+        <w:t xml:space="preserve">  </w:t>
+      </w:r>
+      <w:proofErr w:type="spellStart"/>
+      <w:r>
+        <w:t>Direccion</w:t>
+      </w:r>
+      <w:proofErr w:type="spellEnd"/>
+      <w:r>
+        <w:t>: Texto / Categórica (Neutra, adelante, atrás, derecha, izquierda).</w:t>
+      </w:r>
+    </w:p>
+    <w:p>
+      <w:proofErr w:type="spellStart"/>
+      <w:r>
+        <w:t>velocidad_objetivo</w:t>
+      </w:r>
+      <w:proofErr w:type="spellEnd"/>
+      <w:r>
+        <w:t>: valor normalizado de 0 a 1</w:t>
+      </w:r>
+      <w:r>
+        <w:t>.</w:t>
+      </w:r>
+    </w:p>
+    <w:p>
+      <w:pPr>
+        <w:rPr>
+          <w:b/>
+          <w:bCs/>
+        </w:rPr>
+      </w:pPr>
+      <w:r>
+        <w:rPr>
+          <w:b/>
+          <w:bCs/>
+        </w:rPr>
+        <w:t>frecuencia de adquisición:</w:t>
+      </w:r>
+    </w:p>
+    <w:p>
+      <w:r>
+        <w:t>100 Hz</w:t>
+      </w:r>
+    </w:p>
+    <w:p>
+      <w:pPr>
+        <w:rPr>
+          <w:b/>
+          <w:bCs/>
+        </w:rPr>
+      </w:pPr>
+      <w:proofErr w:type="spellStart"/>
+      <w:r>
+        <w:rPr>
+          <w:b/>
+          <w:bCs/>
+        </w:rPr>
         <w:lastRenderedPageBreak/>
-        <w:t>unidades:</w:t>
-      </w:r>
-    </w:p>
-    <w:p>
-      <w:r>
-        <w:t xml:space="preserve"> </w:t>
-      </w:r>
-      <w:proofErr w:type="spellStart"/>
-      <w:r>
-        <w:rPr>
-          <w:b/>
-          <w:bCs/>
-        </w:rPr>
-        <w:t>user_id</w:t>
+        <w:t>θ_max</w:t>
       </w:r>
       <w:proofErr w:type="spellEnd"/>
       <w:r>
-        <w:t>: Entero sin unidad (Identificador).</w:t>
-      </w:r>
-    </w:p>
-    <w:p>
-      <w:proofErr w:type="spellStart"/>
-      <w:r>
-        <w:rPr>
-          <w:b/>
-          <w:bCs/>
-        </w:rPr>
-        <w:t>trial_id</w:t>
-      </w:r>
-      <w:proofErr w:type="spellEnd"/>
-      <w:r>
-        <w:t>: Entero sin unidad (Número de ensayo).</w:t>
-      </w:r>
-    </w:p>
-    <w:p>
-      <w:proofErr w:type="spellStart"/>
-      <w:r>
-        <w:rPr>
-          <w:b/>
-          <w:bCs/>
-        </w:rPr>
-        <w:t>sample_id</w:t>
-      </w:r>
-      <w:proofErr w:type="spellEnd"/>
-      <w:r>
-        <w:t>: Entero sin unidad (Número de muestra consecutiva).</w:t>
-      </w:r>
-    </w:p>
-    <w:p>
-      <w:proofErr w:type="spellStart"/>
-      <w:r>
-        <w:rPr>
-          <w:b/>
-          <w:bCs/>
-        </w:rPr>
-        <w:t>a_x</w:t>
-      </w:r>
-      <w:proofErr w:type="spellEnd"/>
-      <w:r>
-        <w:rPr>
-          <w:b/>
-          <w:bCs/>
-        </w:rPr>
-        <w:t xml:space="preserve">, </w:t>
-      </w:r>
-      <w:proofErr w:type="spellStart"/>
-      <w:r>
-        <w:rPr>
-          <w:b/>
-          <w:bCs/>
-        </w:rPr>
-        <w:t>a_y</w:t>
-      </w:r>
-      <w:proofErr w:type="spellEnd"/>
-      <w:r>
-        <w:rPr>
-          <w:b/>
-          <w:bCs/>
-        </w:rPr>
-        <w:t xml:space="preserve">, </w:t>
-      </w:r>
-      <w:proofErr w:type="spellStart"/>
-      <w:r>
-        <w:rPr>
-          <w:b/>
-          <w:bCs/>
-        </w:rPr>
-        <w:t>a_z</w:t>
-      </w:r>
-      <w:proofErr w:type="spellEnd"/>
-      <w:r>
-        <w:t xml:space="preserve">: </w:t>
-      </w:r>
-      <w:r>
-        <w:t>Metros por segundo al cuadrado</w:t>
-      </w:r>
-      <w:r>
-        <w:t>.</w:t>
-      </w:r>
-    </w:p>
-    <w:p>
-      <w:r>
-        <w:t xml:space="preserve">  </w:t>
-      </w:r>
-      <w:proofErr w:type="spellStart"/>
-      <w:r>
-        <w:rPr>
-          <w:b/>
-          <w:bCs/>
-        </w:rPr>
-        <w:t>w_x</w:t>
-      </w:r>
-      <w:proofErr w:type="spellEnd"/>
-      <w:r>
-        <w:rPr>
-          <w:b/>
-          <w:bCs/>
-        </w:rPr>
-        <w:t xml:space="preserve">, </w:t>
-      </w:r>
-      <w:proofErr w:type="spellStart"/>
-      <w:r>
-        <w:rPr>
-          <w:b/>
-          <w:bCs/>
-        </w:rPr>
-        <w:t>w_y</w:t>
-      </w:r>
-      <w:proofErr w:type="spellEnd"/>
-      <w:r>
-        <w:rPr>
-          <w:b/>
-          <w:bCs/>
-        </w:rPr>
-        <w:t xml:space="preserve">, </w:t>
-      </w:r>
-      <w:proofErr w:type="spellStart"/>
-      <w:r>
-        <w:rPr>
-          <w:b/>
-          <w:bCs/>
-        </w:rPr>
-        <w:t>w_z</w:t>
-      </w:r>
-      <w:proofErr w:type="spellEnd"/>
-      <w:r>
-        <w:t xml:space="preserve">: </w:t>
-      </w:r>
-      <w:r>
-        <w:rPr>
-          <w:b/>
-          <w:bCs/>
-        </w:rPr>
-        <w:t>rad/s</w:t>
-      </w:r>
-      <w:r>
-        <w:t xml:space="preserve"> </w:t>
-      </w:r>
-      <w:r>
-        <w:t>Grados por segundo</w:t>
-      </w:r>
-      <w:r>
-        <w:t>.</w:t>
-      </w:r>
-    </w:p>
-    <w:p>
-      <w:r>
-        <w:t xml:space="preserve">  </w:t>
-      </w:r>
-      <w:proofErr w:type="spellStart"/>
-      <w:r>
-        <w:rPr>
-          <w:b/>
-          <w:bCs/>
-        </w:rPr>
-        <w:t>m_x</w:t>
-      </w:r>
-      <w:proofErr w:type="spellEnd"/>
-      <w:r>
-        <w:rPr>
-          <w:b/>
-          <w:bCs/>
-        </w:rPr>
-        <w:t xml:space="preserve">, </w:t>
-      </w:r>
-      <w:proofErr w:type="spellStart"/>
-      <w:r>
-        <w:rPr>
-          <w:b/>
-          <w:bCs/>
-        </w:rPr>
-        <w:t>m_y</w:t>
-      </w:r>
-      <w:proofErr w:type="spellEnd"/>
-      <w:r>
-        <w:rPr>
-          <w:b/>
-          <w:bCs/>
-        </w:rPr>
-        <w:t xml:space="preserve">, </w:t>
-      </w:r>
-      <w:proofErr w:type="spellStart"/>
-      <w:r>
-        <w:rPr>
-          <w:b/>
-          <w:bCs/>
-        </w:rPr>
-        <w:t>m_z</w:t>
-      </w:r>
-      <w:proofErr w:type="spellEnd"/>
-      <w:r>
-        <w:t xml:space="preserve">: </w:t>
-      </w:r>
-      <w:proofErr w:type="spellStart"/>
-      <w:r>
-        <w:t>Microteslas</w:t>
-      </w:r>
-      <w:proofErr w:type="spellEnd"/>
-      <w:r>
-        <w:t>.</w:t>
-      </w:r>
-    </w:p>
-    <w:p>
-      <w:r>
-        <w:t xml:space="preserve">  </w:t>
-      </w:r>
-      <w:proofErr w:type="spellStart"/>
-      <w:r>
-        <w:rPr>
-          <w:b/>
-          <w:bCs/>
-        </w:rPr>
-        <w:t>Direccion</w:t>
-      </w:r>
-      <w:proofErr w:type="spellEnd"/>
-      <w:r>
-        <w:t>: Texto / Categórica (Neutra, adelante, atrás, derecha, izquierda).</w:t>
-      </w:r>
-    </w:p>
-    <w:p>
-      <w:proofErr w:type="spellStart"/>
-      <w:r>
-        <w:rPr>
-          <w:b/>
-          <w:bCs/>
-        </w:rPr>
-        <w:t>velocidad_objetivo</w:t>
-      </w:r>
-      <w:proofErr w:type="spellEnd"/>
-      <w:r>
-        <w:t>: valor normalizado de 0 a 1</w:t>
-      </w:r>
-      <w:r>
-        <w:t>.</w:t>
-      </w:r>
-    </w:p>
-    <w:p/>
-    <w:p>
-      <w:pPr>
-        <w:rPr>
-          <w:b/>
-          <w:bCs/>
-        </w:rPr>
-      </w:pPr>
-      <w:r>
-        <w:rPr>
-          <w:b/>
-          <w:bCs/>
-        </w:rPr>
-        <w:t>frecuencia de adquisición:</w:t>
-      </w:r>
-    </w:p>
-    <w:p>
-      <w:r>
-        <w:t>100 Hz</w:t>
-      </w:r>
-    </w:p>
-    <w:p>
-      <w:pPr>
-        <w:rPr>
-          <w:b/>
-          <w:bCs/>
-        </w:rPr>
-      </w:pPr>
-      <w:proofErr w:type="spellStart"/>
-      <w:r>
-        <w:rPr>
-          <w:b/>
-          <w:bCs/>
-        </w:rPr>
-        <w:t>θ_max</w:t>
-      </w:r>
-      <w:proofErr w:type="spellEnd"/>
-      <w:r>
         <w:rPr>
           <w:b/>
           <w:bCs/>
@@ -691,36 +735,98 @@
           <w:bCs/>
         </w:rPr>
       </w:pPr>
-    </w:p>
-    <w:p>
-      <w:pPr>
-        <w:rPr>
-          <w:b/>
-          <w:bCs/>
-        </w:rPr>
-      </w:pPr>
-      <w:r>
-        <w:rPr>
-          <w:b/>
-          <w:bCs/>
-        </w:rPr>
-        <w:t>tamaño de la base de datos final</w:t>
-      </w:r>
-      <w:r>
-        <w:rPr>
-          <w:b/>
-          <w:bCs/>
-        </w:rPr>
-        <w:t>:</w:t>
-      </w:r>
-    </w:p>
-    <w:p>
-      <w:pPr>
-        <w:rPr>
-          <w:b/>
-          <w:bCs/>
-        </w:rPr>
-      </w:pPr>
+      <w:r>
+        <w:rPr>
+          <w:b/>
+          <w:bCs/>
+          <w:noProof/>
+        </w:rPr>
+        <w:drawing>
+          <wp:inline distT="0" distB="0" distL="0" distR="0" wp14:anchorId="668A0401" wp14:editId="1DE41FC7">
+            <wp:extent cx="3476625" cy="4048125"/>
+            <wp:effectExtent l="0" t="0" r="9525" b="9525"/>
+            <wp:docPr id="37" name="Imagen 37"/>
+            <wp:cNvGraphicFramePr>
+              <a:graphicFrameLocks xmlns:a="http://schemas.openxmlformats.org/drawingml/2006/main" noChangeAspect="1"/>
+            </wp:cNvGraphicFramePr>
+            <a:graphic xmlns:a="http://schemas.openxmlformats.org/drawingml/2006/main">
+              <a:graphicData uri="http://schemas.openxmlformats.org/drawingml/2006/picture">
+                <pic:pic xmlns:pic="http://schemas.openxmlformats.org/drawingml/2006/picture">
+                  <pic:nvPicPr>
+                    <pic:cNvPr id="1" name=""/>
+                    <pic:cNvPicPr/>
+                  </pic:nvPicPr>
+                  <pic:blipFill rotWithShape="1">
+                    <a:blip r:embed="rId14"/>
+                    <a:srcRect t="1162" r="9429"/>
+                    <a:stretch/>
+                  </pic:blipFill>
+                  <pic:spPr bwMode="auto">
+                    <a:xfrm>
+                      <a:off x="0" y="0"/>
+                      <a:ext cx="3477110" cy="4048690"/>
+                    </a:xfrm>
+                    <a:prstGeom prst="rect">
+                      <a:avLst/>
+                    </a:prstGeom>
+                    <a:ln>
+                      <a:noFill/>
+                    </a:ln>
+                    <a:extLst>
+                      <a:ext uri="{53640926-AAD7-44D8-BBD7-CCE9431645EC}">
+                        <a14:shadowObscured xmlns:a14="http://schemas.microsoft.com/office/drawing/2010/main"/>
+                      </a:ext>
+                    </a:extLst>
+                  </pic:spPr>
+                </pic:pic>
+              </a:graphicData>
+            </a:graphic>
+          </wp:inline>
+        </w:drawing>
+      </w:r>
+    </w:p>
+    <w:p>
+      <w:pPr>
+        <w:rPr>
+          <w:b/>
+          <w:bCs/>
+        </w:rPr>
+      </w:pPr>
+      <w:r>
+        <w:rPr>
+          <w:b/>
+          <w:bCs/>
+        </w:rPr>
+        <w:t>tamaño de la base de datos final:</w:t>
+      </w:r>
+    </w:p>
+    <w:p>
+      <w:r>
+        <w:t>10579x14 (contando etiquetas)</w:t>
+      </w:r>
+    </w:p>
+    <w:p>
+      <w:r>
+        <w:t>10579x9 (sin contar etiquetas)</w:t>
+      </w:r>
+    </w:p>
+    <w:p>
+      <w:pPr>
+        <w:rPr>
+          <w:b/>
+          <w:bCs/>
+        </w:rPr>
+      </w:pPr>
+      <w:r>
+        <w:rPr>
+          <w:b/>
+          <w:bCs/>
+        </w:rPr>
+        <w:t xml:space="preserve">Instrucciones para grabar ensayos: </w:t>
+      </w:r>
+      <w:r>
+        <w:t>Para grabar ensayos se debe correr el código en el archivo receptorDB2.py. Luego, en la terminal se pueden observar los diferentes comandos y las instrucciones sobre el movimiento a grabar. Luego de leer las instrucciones, solo se debe presionar “R” y realizar el movimiento. También hay otros comandos útiles como “U” para cambiar usuario y “D” para borrar el ensayo anterior a mano.</w:t>
+      </w:r>
     </w:p>
     <w:sectPr>
       <w:pgSz w:w="12240" w:h="15840"/>
@@ -1134,6 +1240,7 @@
   <w:style w:type="character" w:default="1" w:styleId="Fuentedeprrafopredeter">
     <w:name w:val="Default Paragraph Font"/>
     <w:uiPriority w:val="1"/>
+    <w:semiHidden/>
     <w:unhideWhenUsed/>
   </w:style>
   <w:style w:type="table" w:default="1" w:styleId="Tablanormal">
@@ -1246,7 +1353,7 @@
     </inkml:brush>
   </inkml:definitions>
   <inkml:trace contextRef="#ctx0" brushRef="#br0">400 1 2292,'0'0'-77,"-3"10"-118,-10 29 209,10-29 28,2-6 16,-1 12-21,2-13 24,-1 2-25,-1 12 6,2-13 61,-1 1-62,-1 16-4,2-16 6,0-1-7,0 14-1,0-13-10,0 0 3,-1 39 100,-7 48 0,8-88-110,0 1-2,0 58 77,0-42-84,0 8 27,0-24 2,-1 0-30,2 71 40,-1-72-34,0 2 0,0 44-22,0-45 14,-3 44 74,2-44-75,1-1 4,-7 36 82,7-35-50,-1 0-36,-4 16 6,4-16 23,-2 44 62,3-44-70,-1 0-7,-13 130 136,14-129-147,0 20 40,3 2-26,-3-22-28,0-1 19,0 40 50,0-41-69,0 0 12,0 44 126,0-43-110,0 0-22,0 11-4,0-11 29,0 0-9,0 19-9,0-19 13,0-1 8,0 12 18,0-13-34,1 3-27,1 14 15,-2-14-1,0-3 5,6 128 178,-5-127-167,1 11-17,-2-11-45</inkml:trace>
-  <inkml:trace contextRef="#ctx0" brushRef="#br0" timeOffset="1088.36">1 1389 2780,'0'0'846,"9"6"-805,84 71 171,-69-56-129,1-2 0,1-1 1,1-2-1,54 26 0,-57-36-50,-18-6-25,-1 1 10,0-1-16,9 2 55,0-1-1,0-1 1,-1 0 0,1-1 0,26-6-1,-36 7 47,-3 0-95,0 0 0,0 0 0,-1 1 1,1-1-1,0 0 0,0 0 0,0 0 0,0 0 0,-1 0 0,1 0 0,0 0 1,0-1-1,0 1 0,-1 0 0,1 0 0,0 0 0,0-1 0,-1 1 1,1-1-1,0 1 0,0 0 0,-1-1 0,1 1 0,0-1 0,-1 1 0,1-1 1,-1 0-1,1 1 0,-1-1 0,1 0 0,0-1 0,16-28 260,-13 20-267,2 1 15,-1-1 0,0 1 0,0-1 0,-1 0-1,-1-1 1,0 1 0,3-18 0,12-45 36,-17 69-49,3-14-551,1-1-1,14-31 1,-17 46 310</inkml:trace>
+  <inkml:trace contextRef="#ctx0" brushRef="#br0" timeOffset="1088.34">1 1389 2780,'0'0'846,"9"6"-805,84 71 171,-69-56-129,1-2 0,1-1 1,1-2-1,54 26 0,-57-36-50,-18-6-25,-1 1 10,0-1-16,9 2 55,0-1-1,0-1 1,-1 0 0,1-1 0,26-6-1,-36 7 47,-3 0-95,0 0 0,0 0 0,-1 1 1,1-1-1,0 0 0,0 0 0,0 0 0,0 0 0,-1 0 0,1 0 0,0 0 1,0-1-1,0 1 0,-1 0 0,1 0 0,0 0 0,0-1 0,-1 1 1,1-1-1,0 1 0,0 0 0,-1-1 0,1 1 0,0-1 0,-1 1 0,1-1 1,-1 0-1,1 1 0,-1-1 0,1 0 0,0-1 0,16-28 260,-13 20-267,2 1 15,-1-1 0,0 1 0,0-1 0,-1 0-1,-1-1 1,0 1 0,3-18 0,12-45 36,-17 69-49,3-14-551,1-1-1,14-31 1,-17 46 310</inkml:trace>
   <inkml:trace contextRef="#ctx0" brushRef="#br0" timeOffset="2565.31">769 1761 2520,'0'0'1032,"-5"9"-962,-117 178 542,75-115-379,-70 142 0,115-211-250,0 3-311,-1 1 0,-1-1 1,1 0-1,-1 0 0,0-1 0,-1 1 0,-4 5 0,6-9 124</inkml:trace>
   <inkml:trace contextRef="#ctx0" brushRef="#br0" timeOffset="3522.03">276 1871 2672,'0'0'1037,"9"4"-976,65 22 397,-54-20-431,-15-4-9,0-2 2,16 2 6,-16-2 11,1 1-5,15 3-18,-15-3-1,17 1 6,0 2 30,1 0 0,23 9 0,-42-12-40,0 1-23,-1-1 6,107 46 69,-53-20-36,-16-2-29,-23-15-3,-1 1 0,0 0 0,20 17 0,-35-25-18,0-1-14,26 22-57,-27-21 48,1-1-14,8 9 0,-9-8 3,1-1-2,-1 0 67,3 2-344,1 0 0,-1 0 1,0 1-1,0 0 0,0 0 0,4 7 0</inkml:trace>
 </inkml:ink>

</xml_diff>

<commit_message>
añadido el link del repositorio a la descripcion del sistema
</commit_message>
<xml_diff>
--- a/descripcionSistema.docx
+++ b/descripcionSistema.docx
@@ -2,6 +2,24 @@
 <file path=word/document.xml><?xml version="1.0" encoding="utf-8"?>
 <w:document xmlns:wpc="http://schemas.microsoft.com/office/word/2010/wordprocessingCanvas" xmlns:cx="http://schemas.microsoft.com/office/drawing/2014/chartex" xmlns:cx1="http://schemas.microsoft.com/office/drawing/2015/9/8/chartex" xmlns:cx2="http://schemas.microsoft.com/office/drawing/2015/10/21/chartex" xmlns:cx3="http://schemas.microsoft.com/office/drawing/2016/5/9/chartex" xmlns:cx4="http://schemas.microsoft.com/office/drawing/2016/5/10/chartex" xmlns:cx5="http://schemas.microsoft.com/office/drawing/2016/5/11/chartex" xmlns:cx6="http://schemas.microsoft.com/office/drawing/2016/5/12/chartex" xmlns:cx7="http://schemas.microsoft.com/office/drawing/2016/5/13/chartex" xmlns:cx8="http://schemas.microsoft.com/office/drawing/2016/5/14/chartex" xmlns:mc="http://schemas.openxmlformats.org/markup-compatibility/2006" xmlns:aink="http://schemas.microsoft.com/office/drawing/2016/ink" xmlns:am3d="http://schemas.microsoft.com/office/drawing/2017/model3d" xmlns:o="urn:schemas-microsoft-com:office:office" xmlns:r="http://schemas.openxmlformats.org/officeDocument/2006/relationships" xmlns:m="http://schemas.openxmlformats.org/officeDocument/2006/math" xmlns:v="urn:schemas-microsoft-com:vml" xmlns:wp14="http://schemas.microsoft.com/office/word/2010/wordprocessingDrawing" xmlns:wp="http://schemas.openxmlformats.org/drawingml/2006/wordprocessingDrawing" xmlns:w10="urn:schemas-microsoft-com:office:word" xmlns:w="http://schemas.openxmlformats.org/wordprocessingml/2006/main" xmlns:w14="http://schemas.microsoft.com/office/word/2010/wordml" xmlns:w15="http://schemas.microsoft.com/office/word/2012/wordml" xmlns:w16cex="http://schemas.microsoft.com/office/word/2018/wordml/cex" xmlns:w16cid="http://schemas.microsoft.com/office/word/2016/wordml/cid" xmlns:w16="http://schemas.microsoft.com/office/word/2018/wordml" xmlns:w16sdtdh="http://schemas.microsoft.com/office/word/2020/wordml/sdtdatahash" xmlns:w16se="http://schemas.microsoft.com/office/word/2015/wordml/symex" xmlns:wpg="http://schemas.microsoft.com/office/word/2010/wordprocessingGroup" xmlns:wpi="http://schemas.microsoft.com/office/word/2010/wordprocessingInk" xmlns:wne="http://schemas.microsoft.com/office/word/2006/wordml" xmlns:wps="http://schemas.microsoft.com/office/word/2010/wordprocessingShape" mc:Ignorable="w14 w15 w16se w16cid w16 w16cex w16sdtdh wp14">
   <w:body>
+    <w:p>
+      <w:pPr>
+        <w:rPr>
+          <w:b/>
+          <w:bCs/>
+        </w:rPr>
+      </w:pPr>
+      <w:r>
+        <w:rPr>
+          <w:b/>
+          <w:bCs/>
+        </w:rPr>
+        <w:t xml:space="preserve">Link repositorio: </w:t>
+      </w:r>
+      <w:r>
+        <w:t>https://github.com/sp1aw/joystickVS</w:t>
+      </w:r>
+    </w:p>
     <w:p>
       <w:pPr>
         <w:rPr>
@@ -295,21 +313,20 @@
           <w:bCs/>
         </w:rPr>
       </w:pPr>
-    </w:p>
-    <w:p>
-      <w:pPr>
-        <w:rPr>
-          <w:b/>
-          <w:bCs/>
-        </w:rPr>
-      </w:pPr>
       <w:r>
         <w:rPr>
           <w:b/>
           <w:bCs/>
         </w:rPr>
         <w:lastRenderedPageBreak/>
-        <w:t>convención de ejes:</w:t>
+        <w:t>C</w:t>
+      </w:r>
+      <w:r>
+        <w:rPr>
+          <w:b/>
+          <w:bCs/>
+        </w:rPr>
+        <w:t>onvención de ejes:</w:t>
       </w:r>
     </w:p>
     <w:p>
@@ -523,7 +540,14 @@
           <w:b/>
           <w:bCs/>
         </w:rPr>
-        <w:t>unidades:</w:t>
+        <w:t>U</w:t>
+      </w:r>
+      <w:r>
+        <w:rPr>
+          <w:b/>
+          <w:bCs/>
+        </w:rPr>
+        <w:t>nidades:</w:t>
       </w:r>
     </w:p>
     <w:p>
@@ -695,7 +719,14 @@
           <w:b/>
           <w:bCs/>
         </w:rPr>
-        <w:t>frecuencia de adquisición:</w:t>
+        <w:t>F</w:t>
+      </w:r>
+      <w:r>
+        <w:rPr>
+          <w:b/>
+          <w:bCs/>
+        </w:rPr>
+        <w:t>recuencia de adquisición:</w:t>
       </w:r>
     </w:p>
     <w:p>
@@ -797,7 +828,14 @@
           <w:b/>
           <w:bCs/>
         </w:rPr>
-        <w:t>tamaño de la base de datos final:</w:t>
+        <w:t>T</w:t>
+      </w:r>
+      <w:r>
+        <w:rPr>
+          <w:b/>
+          <w:bCs/>
+        </w:rPr>
+        <w:t>amaño de la base de datos final:</w:t>
       </w:r>
     </w:p>
     <w:p>
@@ -811,12 +849,6 @@
       </w:r>
     </w:p>
     <w:p>
-      <w:pPr>
-        <w:rPr>
-          <w:b/>
-          <w:bCs/>
-        </w:rPr>
-      </w:pPr>
       <w:r>
         <w:rPr>
           <w:b/>
@@ -1353,7 +1385,7 @@
     </inkml:brush>
   </inkml:definitions>
   <inkml:trace contextRef="#ctx0" brushRef="#br0">400 1 2292,'0'0'-77,"-3"10"-118,-10 29 209,10-29 28,2-6 16,-1 12-21,2-13 24,-1 2-25,-1 12 6,2-13 61,-1 1-62,-1 16-4,2-16 6,0-1-7,0 14-1,0-13-10,0 0 3,-1 39 100,-7 48 0,8-88-110,0 1-2,0 58 77,0-42-84,0 8 27,0-24 2,-1 0-30,2 71 40,-1-72-34,0 2 0,0 44-22,0-45 14,-3 44 74,2-44-75,1-1 4,-7 36 82,7-35-50,-1 0-36,-4 16 6,4-16 23,-2 44 62,3-44-70,-1 0-7,-13 130 136,14-129-147,0 20 40,3 2-26,-3-22-28,0-1 19,0 40 50,0-41-69,0 0 12,0 44 126,0-43-110,0 0-22,0 11-4,0-11 29,0 0-9,0 19-9,0-19 13,0-1 8,0 12 18,0-13-34,1 3-27,1 14 15,-2-14-1,0-3 5,6 128 178,-5-127-167,1 11-17,-2-11-45</inkml:trace>
-  <inkml:trace contextRef="#ctx0" brushRef="#br0" timeOffset="1088.34">1 1389 2780,'0'0'846,"9"6"-805,84 71 171,-69-56-129,1-2 0,1-1 1,1-2-1,54 26 0,-57-36-50,-18-6-25,-1 1 10,0-1-16,9 2 55,0-1-1,0-1 1,-1 0 0,1-1 0,26-6-1,-36 7 47,-3 0-95,0 0 0,0 0 0,-1 1 1,1-1-1,0 0 0,0 0 0,0 0 0,0 0 0,-1 0 0,1 0 0,0 0 1,0-1-1,0 1 0,-1 0 0,1 0 0,0 0 0,0-1 0,-1 1 1,1-1-1,0 1 0,0 0 0,-1-1 0,1 1 0,0-1 0,-1 1 0,1-1 1,-1 0-1,1 1 0,-1-1 0,1 0 0,0-1 0,16-28 260,-13 20-267,2 1 15,-1-1 0,0 1 0,0-1 0,-1 0-1,-1-1 1,0 1 0,3-18 0,12-45 36,-17 69-49,3-14-551,1-1-1,14-31 1,-17 46 310</inkml:trace>
+  <inkml:trace contextRef="#ctx0" brushRef="#br0" timeOffset="1088.33">1 1389 2780,'0'0'846,"9"6"-805,84 71 171,-69-56-129,1-2 0,1-1 1,1-2-1,54 26 0,-57-36-50,-18-6-25,-1 1 10,0-1-16,9 2 55,0-1-1,0-1 1,-1 0 0,1-1 0,26-6-1,-36 7 47,-3 0-95,0 0 0,0 0 0,-1 1 1,1-1-1,0 0 0,0 0 0,0 0 0,0 0 0,-1 0 0,1 0 0,0 0 1,0-1-1,0 1 0,-1 0 0,1 0 0,0 0 0,0-1 0,-1 1 1,1-1-1,0 1 0,0 0 0,-1-1 0,1 1 0,0-1 0,-1 1 0,1-1 1,-1 0-1,1 1 0,-1-1 0,1 0 0,0-1 0,16-28 260,-13 20-267,2 1 15,-1-1 0,0 1 0,0-1 0,-1 0-1,-1-1 1,0 1 0,3-18 0,12-45 36,-17 69-49,3-14-551,1-1-1,14-31 1,-17 46 310</inkml:trace>
   <inkml:trace contextRef="#ctx0" brushRef="#br0" timeOffset="2565.31">769 1761 2520,'0'0'1032,"-5"9"-962,-117 178 542,75-115-379,-70 142 0,115-211-250,0 3-311,-1 1 0,-1-1 1,1 0-1,-1 0 0,0-1 0,-1 1 0,-4 5 0,6-9 124</inkml:trace>
   <inkml:trace contextRef="#ctx0" brushRef="#br0" timeOffset="3522.03">276 1871 2672,'0'0'1037,"9"4"-976,65 22 397,-54-20-431,-15-4-9,0-2 2,16 2 6,-16-2 11,1 1-5,15 3-18,-15-3-1,17 1 6,0 2 30,1 0 0,23 9 0,-42-12-40,0 1-23,-1-1 6,107 46 69,-53-20-36,-16-2-29,-23-15-3,-1 1 0,0 0 0,20 17 0,-35-25-18,0-1-14,26 22-57,-27-21 48,1-1-14,8 9 0,-9-8 3,1-1-2,-1 0 67,3 2-344,1 0 0,-1 0 1,0 1-1,0 0 0,0 0 0,4 7 0</inkml:trace>
 </inkml:ink>

</xml_diff>